<commit_message>
Reestructura contenidos y documenta entregables
</commit_message>
<xml_diff>
--- a/Programa - contenidos.docx
+++ b/Programa - contenidos.docx
@@ -110,12 +110,12 @@
           <w:color w:val="173F67"/>
           <w:sz w:val="34"/>
         </w:rPr>
-        <w:t>Módulo 4: Estimación, Ejecución y Seguimiento del Proyecto</w:t>
+        <w:t>Módulo 4: Planificación y Seguimiento del Trabajo en Scrum y Kanban</w:t>
       </w:r>
     </w:p>
     <w:p>
       <w:r>
-        <w:t>Estimación y pronósticos bajo incertidumbre. Tallas de remera, puntos de historia y Planning Poker. Capacidad y disponibilidad del equipo. Velocidad y sus límites como medida para pronosticar. Planificación del Sprint. Visualización del trabajo: tableros, carriles, políticas y límites WIP. Impedimentos, bloqueos, riesgos y dependencias. Métricas de flujo: lead time, cycle time y throughput. Diagrama de flujo acumulado, burndown y burnup. Interpretación de datos para tomar decisiones. Jira, Trello y otras herramientas de seguimiento: organización del trabajo, tableros, filtros e informes; criterios de elección y límites.</w:t>
+        <w:t>Estimación y pronósticos bajo incertidumbre. Planificación y seguimiento en Scrum: Sprint Goal, Sprint Backlog, capacidad, velocidad, tallas de remera, puntos de historia, Planning Poker, burndown y burnup; alcance y límites de cada práctica. Gestión del trabajo en Kanban: demanda continua, políticas explícitas, tableros, límites WIP, lead time, cycle time, throughput, diagrama de flujo acumulado y pronósticos basados en flujo. Impedimentos, bloqueos, riesgos y dependencias como problemas transversales. Jira, Trello, Notion y herramientas de seguimiento. Comparación entre Scrum y Kanban, criterios para combinar prácticas y caso integrador aplicado a un asistente universitario con IA.</w:t>
       </w:r>
     </w:p>
     <w:p>

</xml_diff>